<commit_message>
20261022. Added agents to build/rebuild quarto/qmd_ManFiles.qmd
Added CoPilot and Posit agents to build/rebuild quarto/qmd_ManFiles.qmd.
Removed .posit from .gitignore so files are retained.
</commit_message>
<xml_diff>
--- a/notes/Notes-for-rtmbGMACS-Github-Repo.docx
+++ b/notes/Notes-for-rtmbGMACS-Github-Repo.docx
@@ -303,7 +303,15 @@
         </w:numPr>
       </w:pPr>
       <w:r>
-        <w:t>this prevents GitHub from using it's default approach to creating the website on the "gh-pages" branch</w:t>
+        <w:t xml:space="preserve">this prevents GitHub from using </w:t>
+      </w:r>
+      <w:proofErr w:type="gramStart"/>
+      <w:r>
+        <w:t>it's</w:t>
+      </w:r>
+      <w:proofErr w:type="gramEnd"/>
+      <w:r>
+        <w:t xml:space="preserve"> default approach to creating the website on the "gh-pages" branch</w:t>
       </w:r>
     </w:p>
     <w:p>
@@ -373,6 +381,412 @@
       <w:r>
         <w:t xml:space="preserve"> gh-pages"</w:t>
       </w:r>
+    </w:p>
+    <w:p>
+      <w:pPr>
+        <w:pStyle w:val="Heading2"/>
+      </w:pPr>
+      <w:r>
+        <w:t>Posit notes</w:t>
+      </w:r>
+    </w:p>
+    <w:p>
+      <w:pPr>
+        <w:pStyle w:val="ListParagraph"/>
+        <w:numPr>
+          <w:ilvl w:val="0"/>
+          <w:numId w:val="5"/>
+        </w:numPr>
+      </w:pPr>
+      <w:r>
+        <w:t xml:space="preserve">run </w:t>
+      </w:r>
+      <w:r>
+        <w:rPr>
+          <w:b/>
+          <w:bCs/>
+        </w:rPr>
+        <w:t>/report</w:t>
+      </w:r>
+      <w:r>
+        <w:t xml:space="preserve"> to create a Quarto doc f</w:t>
+      </w:r>
+      <w:r>
+        <w:t>ro</w:t>
+      </w:r>
+      <w:r>
+        <w:t>m the current conversation</w:t>
+      </w:r>
+    </w:p>
+    <w:p>
+      <w:pPr>
+        <w:pStyle w:val="ListParagraph"/>
+        <w:numPr>
+          <w:ilvl w:val="0"/>
+          <w:numId w:val="5"/>
+        </w:numPr>
+        <w:rPr>
+          <w:rStyle w:val="Strong"/>
+          <w:b w:val="0"/>
+          <w:bCs w:val="0"/>
+        </w:rPr>
+      </w:pPr>
+      <w:r>
+        <w:rPr>
+          <w:rStyle w:val="Strong"/>
+          <w:rFonts w:ascii="Arial" w:hAnsi="Arial" w:cs="Arial"/>
+          <w:b w:val="0"/>
+          <w:bCs w:val="0"/>
+          <w:color w:val="3B3B3B"/>
+          <w:sz w:val="20"/>
+          <w:szCs w:val="20"/>
+          <w:shd w:val="clear" w:color="auto" w:fill="FFFFFF"/>
+        </w:rPr>
+        <w:t xml:space="preserve">select </w:t>
+      </w:r>
+      <w:r>
+        <w:rPr>
+          <w:rStyle w:val="Strong"/>
+          <w:rFonts w:ascii="Arial" w:hAnsi="Arial" w:cs="Arial"/>
+          <w:color w:val="3B3B3B"/>
+          <w:sz w:val="20"/>
+          <w:szCs w:val="20"/>
+          <w:shd w:val="clear" w:color="auto" w:fill="FFFFFF"/>
+        </w:rPr>
+        <w:t>man-files-quarto</w:t>
+      </w:r>
+      <w:r>
+        <w:rPr>
+          <w:rStyle w:val="Strong"/>
+          <w:rFonts w:ascii="Arial" w:hAnsi="Arial" w:cs="Arial"/>
+          <w:b w:val="0"/>
+          <w:bCs w:val="0"/>
+          <w:color w:val="3B3B3B"/>
+          <w:sz w:val="20"/>
+          <w:szCs w:val="20"/>
+          <w:shd w:val="clear" w:color="auto" w:fill="FFFFFF"/>
+        </w:rPr>
+        <w:t xml:space="preserve"> from CoPilot chat to reproduce quarto/qmd_ManFiles.qmd</w:t>
+      </w:r>
+    </w:p>
+    <w:p>
+      <w:pPr>
+        <w:pStyle w:val="ListParagraph"/>
+        <w:numPr>
+          <w:ilvl w:val="0"/>
+          <w:numId w:val="5"/>
+        </w:numPr>
+      </w:pPr>
+      <w:r>
+        <w:rPr>
+          <w:rFonts w:ascii="Arial" w:hAnsi="Arial" w:cs="Arial"/>
+          <w:color w:val="3B3B3B"/>
+          <w:sz w:val="20"/>
+          <w:szCs w:val="20"/>
+        </w:rPr>
+        <w:t>Positron does not provide the separate Microsoft </w:t>
+      </w:r>
+      <w:r>
+        <w:rPr>
+          <w:rStyle w:val="Strong"/>
+          <w:rFonts w:ascii="Arial" w:hAnsi="Arial" w:cs="Arial"/>
+          <w:color w:val="3B3B3B"/>
+          <w:sz w:val="20"/>
+          <w:szCs w:val="20"/>
+        </w:rPr>
+        <w:t>GitHub Copilot Chat</w:t>
+      </w:r>
+      <w:r>
+        <w:rPr>
+          <w:rFonts w:ascii="Arial" w:hAnsi="Arial" w:cs="Arial"/>
+          <w:color w:val="3B3B3B"/>
+          <w:sz w:val="20"/>
+          <w:szCs w:val="20"/>
+        </w:rPr>
+        <w:t> extension. Instead:</w:t>
+      </w:r>
+    </w:p>
+    <w:p>
+      <w:pPr>
+        <w:pStyle w:val="ListParagraph"/>
+        <w:numPr>
+          <w:ilvl w:val="1"/>
+          <w:numId w:val="5"/>
+        </w:numPr>
+      </w:pPr>
+      <w:r>
+        <w:rPr>
+          <w:rFonts w:ascii="Arial" w:hAnsi="Arial" w:cs="Arial"/>
+          <w:color w:val="3B3B3B"/>
+          <w:sz w:val="20"/>
+          <w:szCs w:val="20"/>
+        </w:rPr>
+        <w:t>Open the Command Palette with </w:t>
+      </w:r>
+      <w:r>
+        <w:rPr>
+          <w:rStyle w:val="Strong"/>
+          <w:rFonts w:ascii="Arial" w:hAnsi="Arial" w:cs="Arial"/>
+          <w:color w:val="3B3B3B"/>
+          <w:sz w:val="20"/>
+          <w:szCs w:val="20"/>
+        </w:rPr>
+        <w:t>Cmd+Shift+P</w:t>
+      </w:r>
+      <w:r>
+        <w:rPr>
+          <w:rFonts w:ascii="Arial" w:hAnsi="Arial" w:cs="Arial"/>
+          <w:color w:val="3B3B3B"/>
+          <w:sz w:val="20"/>
+          <w:szCs w:val="20"/>
+        </w:rPr>
+        <w:t>.</w:t>
+      </w:r>
+    </w:p>
+    <w:p>
+      <w:pPr>
+        <w:pStyle w:val="ListParagraph"/>
+        <w:numPr>
+          <w:ilvl w:val="1"/>
+          <w:numId w:val="5"/>
+        </w:numPr>
+      </w:pPr>
+      <w:r>
+        <w:rPr>
+          <w:rFonts w:ascii="Arial" w:hAnsi="Arial" w:cs="Arial"/>
+          <w:color w:val="3B3B3B"/>
+          <w:sz w:val="20"/>
+          <w:szCs w:val="20"/>
+        </w:rPr>
+        <w:t>Run </w:t>
+      </w:r>
+      <w:r>
+        <w:rPr>
+          <w:rStyle w:val="Strong"/>
+          <w:rFonts w:ascii="Arial" w:hAnsi="Arial" w:cs="Arial"/>
+          <w:color w:val="3B3B3B"/>
+          <w:sz w:val="20"/>
+          <w:szCs w:val="20"/>
+        </w:rPr>
+        <w:t>Authentication: Configure Language Model Providers</w:t>
+      </w:r>
+      <w:r>
+        <w:rPr>
+          <w:rFonts w:ascii="Arial" w:hAnsi="Arial" w:cs="Arial"/>
+          <w:color w:val="3B3B3B"/>
+          <w:sz w:val="20"/>
+          <w:szCs w:val="20"/>
+        </w:rPr>
+        <w:t>.</w:t>
+      </w:r>
+    </w:p>
+    <w:p>
+      <w:pPr>
+        <w:pStyle w:val="ListParagraph"/>
+        <w:numPr>
+          <w:ilvl w:val="1"/>
+          <w:numId w:val="5"/>
+        </w:numPr>
+      </w:pPr>
+      <w:r>
+        <w:rPr>
+          <w:rFonts w:ascii="Arial" w:hAnsi="Arial" w:cs="Arial"/>
+          <w:color w:val="3B3B3B"/>
+          <w:sz w:val="20"/>
+          <w:szCs w:val="20"/>
+        </w:rPr>
+        <w:t>Select </w:t>
+      </w:r>
+      <w:r>
+        <w:rPr>
+          <w:rStyle w:val="Strong"/>
+          <w:rFonts w:ascii="Arial" w:hAnsi="Arial" w:cs="Arial"/>
+          <w:color w:val="3B3B3B"/>
+          <w:sz w:val="20"/>
+          <w:szCs w:val="20"/>
+        </w:rPr>
+        <w:t>GitHub Copilot</w:t>
+      </w:r>
+      <w:r>
+        <w:rPr>
+          <w:rFonts w:ascii="Arial" w:hAnsi="Arial" w:cs="Arial"/>
+          <w:color w:val="3B3B3B"/>
+          <w:sz w:val="20"/>
+          <w:szCs w:val="20"/>
+        </w:rPr>
+        <w:t> and authenticate.</w:t>
+      </w:r>
+    </w:p>
+    <w:p>
+      <w:pPr>
+        <w:pStyle w:val="ListParagraph"/>
+        <w:numPr>
+          <w:ilvl w:val="1"/>
+          <w:numId w:val="5"/>
+        </w:numPr>
+      </w:pPr>
+      <w:r>
+        <w:rPr>
+          <w:rFonts w:ascii="Arial" w:hAnsi="Arial" w:cs="Arial"/>
+          <w:color w:val="3B3B3B"/>
+          <w:sz w:val="20"/>
+          <w:szCs w:val="20"/>
+        </w:rPr>
+        <w:t>Continue using the existing </w:t>
+      </w:r>
+      <w:r>
+        <w:rPr>
+          <w:rStyle w:val="Strong"/>
+          <w:rFonts w:ascii="Arial" w:hAnsi="Arial" w:cs="Arial"/>
+          <w:color w:val="3B3B3B"/>
+          <w:sz w:val="20"/>
+          <w:szCs w:val="20"/>
+        </w:rPr>
+        <w:t>Posit Assistant</w:t>
+      </w:r>
+      <w:r>
+        <w:rPr>
+          <w:rFonts w:ascii="Arial" w:hAnsi="Arial" w:cs="Arial"/>
+          <w:color w:val="3B3B3B"/>
+          <w:sz w:val="20"/>
+          <w:szCs w:val="20"/>
+        </w:rPr>
+        <w:t> chat pane and choose a Copilot model from its model selector.</w:t>
+      </w:r>
+    </w:p>
+    <w:p>
+      <w:pPr>
+        <w:pStyle w:val="ListParagraph"/>
+        <w:numPr>
+          <w:ilvl w:val="2"/>
+          <w:numId w:val="5"/>
+        </w:numPr>
+      </w:pPr>
+      <w:r>
+        <w:rPr>
+          <w:rFonts w:ascii="Arial" w:hAnsi="Arial" w:cs="Arial"/>
+          <w:color w:val="3B3B3B"/>
+          <w:sz w:val="20"/>
+          <w:szCs w:val="20"/>
+        </w:rPr>
+        <w:lastRenderedPageBreak/>
+        <w:t>Correction: the custom agent created earlier is VS Code/Copilot format and may not be runnable by current Posit Assistant. Use it in Microsoft VS Code with GitHub Copilot Chat, or it can be converted into a Posit Assistant skill.</w:t>
+      </w:r>
+    </w:p>
+    <w:p>
+      <w:pPr>
+        <w:pStyle w:val="ListParagraph"/>
+        <w:numPr>
+          <w:ilvl w:val="1"/>
+          <w:numId w:val="5"/>
+        </w:numPr>
+      </w:pPr>
+      <w:r>
+        <w:rPr>
+          <w:rFonts w:ascii="Arial" w:hAnsi="Arial" w:cs="Arial"/>
+          <w:color w:val="3B3B3B"/>
+          <w:sz w:val="20"/>
+          <w:szCs w:val="20"/>
+          <w:shd w:val="clear" w:color="auto" w:fill="FFFFFF"/>
+        </w:rPr>
+        <w:t xml:space="preserve">Posit Assistant skill </w:t>
+      </w:r>
+      <w:proofErr w:type="gramStart"/>
+      <w:r>
+        <w:rPr>
+          <w:rFonts w:ascii="Arial" w:hAnsi="Arial" w:cs="Arial"/>
+          <w:color w:val="3B3B3B"/>
+          <w:sz w:val="20"/>
+          <w:szCs w:val="20"/>
+          <w:shd w:val="clear" w:color="auto" w:fill="FFFFFF"/>
+        </w:rPr>
+        <w:t>at </w:t>
+      </w:r>
+      <w:r>
+        <w:t>.</w:t>
+      </w:r>
+      <w:proofErr w:type="gramEnd"/>
+      <w:r>
+        <w:t>posit/assistant/skills/man-files-quarto/SKILL.md</w:t>
+      </w:r>
+      <w:r>
+        <w:rPr>
+          <w:rFonts w:ascii="Arial" w:hAnsi="Arial" w:cs="Arial"/>
+          <w:color w:val="3B3B3B"/>
+          <w:sz w:val="20"/>
+          <w:szCs w:val="20"/>
+          <w:shd w:val="clear" w:color="auto" w:fill="FFFFFF"/>
+        </w:rPr>
+        <w:t>.</w:t>
+      </w:r>
+      <w:r>
+        <w:rPr>
+          <w:rFonts w:ascii="Arial" w:hAnsi="Arial" w:cs="Arial"/>
+          <w:color w:val="3B3B3B"/>
+          <w:sz w:val="20"/>
+          <w:szCs w:val="20"/>
+          <w:shd w:val="clear" w:color="auto" w:fill="FFFFFF"/>
+        </w:rPr>
+        <w:t xml:space="preserve"> </w:t>
+      </w:r>
+    </w:p>
+    <w:p>
+      <w:pPr>
+        <w:pStyle w:val="ListParagraph"/>
+        <w:numPr>
+          <w:ilvl w:val="2"/>
+          <w:numId w:val="5"/>
+        </w:numPr>
+      </w:pPr>
+      <w:r>
+        <w:rPr>
+          <w:rFonts w:ascii="Arial" w:hAnsi="Arial" w:cs="Arial"/>
+          <w:color w:val="3B3B3B"/>
+          <w:sz w:val="20"/>
+          <w:szCs w:val="20"/>
+          <w:shd w:val="clear" w:color="auto" w:fill="FFFFFF"/>
+        </w:rPr>
+        <w:t xml:space="preserve">Invoke it by asking: </w:t>
+      </w:r>
+      <w:r>
+        <w:rPr>
+          <w:rFonts w:ascii="Arial" w:hAnsi="Arial" w:cs="Arial"/>
+          <w:color w:val="3B3B3B"/>
+          <w:sz w:val="20"/>
+          <w:szCs w:val="20"/>
+          <w:shd w:val="clear" w:color="auto" w:fill="FFFFFF"/>
+        </w:rPr>
+        <w:t>“Regenerate </w:t>
+      </w:r>
+      <w:r>
+        <w:rPr>
+          <w:rStyle w:val="HTMLCode"/>
+          <w:rFonts w:ascii="Menlo" w:eastAsiaTheme="minorHAnsi" w:hAnsi="Menlo" w:cs="Menlo"/>
+          <w:color w:val="3B3B3B"/>
+          <w:sz w:val="18"/>
+          <w:szCs w:val="18"/>
+        </w:rPr>
+        <w:t>qmd_ManFiles.qmd</w:t>
+      </w:r>
+      <w:r>
+        <w:rPr>
+          <w:rFonts w:ascii="Arial" w:hAnsi="Arial" w:cs="Arial"/>
+          <w:color w:val="3B3B3B"/>
+          <w:sz w:val="20"/>
+          <w:szCs w:val="20"/>
+          <w:shd w:val="clear" w:color="auto" w:fill="FFFFFF"/>
+        </w:rPr>
+        <w:t>.” </w:t>
+      </w:r>
+    </w:p>
+    <w:p>
+      <w:pPr>
+        <w:pStyle w:val="ListParagraph"/>
+        <w:numPr>
+          <w:ilvl w:val="1"/>
+          <w:numId w:val="5"/>
+        </w:numPr>
+      </w:pPr>
     </w:p>
     <w:sectPr>
       <w:pgSz w:w="12240" w:h="15840"/>
@@ -910,6 +1324,232 @@
       </w:rPr>
     </w:lvl>
   </w:abstractNum>
+  <w:abstractNum w:abstractNumId="4" w15:restartNumberingAfterBreak="0">
+    <w:nsid w:val="46183BD0"/>
+    <w:multiLevelType w:val="multilevel"/>
+    <w:tmpl w:val="C69499BE"/>
+    <w:lvl w:ilvl="0">
+      <w:start w:val="1"/>
+      <w:numFmt w:val="decimal"/>
+      <w:lvlText w:val="%1."/>
+      <w:lvlJc w:val="left"/>
+      <w:pPr>
+        <w:tabs>
+          <w:tab w:val="num" w:pos="720"/>
+        </w:tabs>
+        <w:ind w:left="720" w:hanging="360"/>
+      </w:pPr>
+    </w:lvl>
+    <w:lvl w:ilvl="1" w:tentative="1">
+      <w:start w:val="1"/>
+      <w:numFmt w:val="decimal"/>
+      <w:lvlText w:val="%2."/>
+      <w:lvlJc w:val="left"/>
+      <w:pPr>
+        <w:tabs>
+          <w:tab w:val="num" w:pos="1440"/>
+        </w:tabs>
+        <w:ind w:left="1440" w:hanging="360"/>
+      </w:pPr>
+    </w:lvl>
+    <w:lvl w:ilvl="2" w:tentative="1">
+      <w:start w:val="1"/>
+      <w:numFmt w:val="decimal"/>
+      <w:lvlText w:val="%3."/>
+      <w:lvlJc w:val="left"/>
+      <w:pPr>
+        <w:tabs>
+          <w:tab w:val="num" w:pos="2160"/>
+        </w:tabs>
+        <w:ind w:left="2160" w:hanging="360"/>
+      </w:pPr>
+    </w:lvl>
+    <w:lvl w:ilvl="3" w:tentative="1">
+      <w:start w:val="1"/>
+      <w:numFmt w:val="decimal"/>
+      <w:lvlText w:val="%4."/>
+      <w:lvlJc w:val="left"/>
+      <w:pPr>
+        <w:tabs>
+          <w:tab w:val="num" w:pos="2880"/>
+        </w:tabs>
+        <w:ind w:left="2880" w:hanging="360"/>
+      </w:pPr>
+    </w:lvl>
+    <w:lvl w:ilvl="4" w:tentative="1">
+      <w:start w:val="1"/>
+      <w:numFmt w:val="decimal"/>
+      <w:lvlText w:val="%5."/>
+      <w:lvlJc w:val="left"/>
+      <w:pPr>
+        <w:tabs>
+          <w:tab w:val="num" w:pos="3600"/>
+        </w:tabs>
+        <w:ind w:left="3600" w:hanging="360"/>
+      </w:pPr>
+    </w:lvl>
+    <w:lvl w:ilvl="5" w:tentative="1">
+      <w:start w:val="1"/>
+      <w:numFmt w:val="decimal"/>
+      <w:lvlText w:val="%6."/>
+      <w:lvlJc w:val="left"/>
+      <w:pPr>
+        <w:tabs>
+          <w:tab w:val="num" w:pos="4320"/>
+        </w:tabs>
+        <w:ind w:left="4320" w:hanging="360"/>
+      </w:pPr>
+    </w:lvl>
+    <w:lvl w:ilvl="6" w:tentative="1">
+      <w:start w:val="1"/>
+      <w:numFmt w:val="decimal"/>
+      <w:lvlText w:val="%7."/>
+      <w:lvlJc w:val="left"/>
+      <w:pPr>
+        <w:tabs>
+          <w:tab w:val="num" w:pos="5040"/>
+        </w:tabs>
+        <w:ind w:left="5040" w:hanging="360"/>
+      </w:pPr>
+    </w:lvl>
+    <w:lvl w:ilvl="7" w:tentative="1">
+      <w:start w:val="1"/>
+      <w:numFmt w:val="decimal"/>
+      <w:lvlText w:val="%8."/>
+      <w:lvlJc w:val="left"/>
+      <w:pPr>
+        <w:tabs>
+          <w:tab w:val="num" w:pos="5760"/>
+        </w:tabs>
+        <w:ind w:left="5760" w:hanging="360"/>
+      </w:pPr>
+    </w:lvl>
+    <w:lvl w:ilvl="8" w:tentative="1">
+      <w:start w:val="1"/>
+      <w:numFmt w:val="decimal"/>
+      <w:lvlText w:val="%9."/>
+      <w:lvlJc w:val="left"/>
+      <w:pPr>
+        <w:tabs>
+          <w:tab w:val="num" w:pos="6480"/>
+        </w:tabs>
+        <w:ind w:left="6480" w:hanging="360"/>
+      </w:pPr>
+    </w:lvl>
+  </w:abstractNum>
+  <w:abstractNum w:abstractNumId="5" w15:restartNumberingAfterBreak="0">
+    <w:nsid w:val="5EE24877"/>
+    <w:multiLevelType w:val="hybridMultilevel"/>
+    <w:tmpl w:val="9AAC42EC"/>
+    <w:lvl w:ilvl="0" w:tplc="04090001">
+      <w:start w:val="1"/>
+      <w:numFmt w:val="bullet"/>
+      <w:lvlText w:val=""/>
+      <w:lvlJc w:val="left"/>
+      <w:pPr>
+        <w:ind w:left="720" w:hanging="360"/>
+      </w:pPr>
+      <w:rPr>
+        <w:rFonts w:ascii="Symbol" w:hAnsi="Symbol" w:hint="default"/>
+      </w:rPr>
+    </w:lvl>
+    <w:lvl w:ilvl="1" w:tplc="04090003">
+      <w:start w:val="1"/>
+      <w:numFmt w:val="bullet"/>
+      <w:lvlText w:val="o"/>
+      <w:lvlJc w:val="left"/>
+      <w:pPr>
+        <w:ind w:left="1440" w:hanging="360"/>
+      </w:pPr>
+      <w:rPr>
+        <w:rFonts w:ascii="Courier New" w:hAnsi="Courier New" w:cs="Courier New" w:hint="default"/>
+      </w:rPr>
+    </w:lvl>
+    <w:lvl w:ilvl="2" w:tplc="04090005">
+      <w:start w:val="1"/>
+      <w:numFmt w:val="bullet"/>
+      <w:lvlText w:val=""/>
+      <w:lvlJc w:val="left"/>
+      <w:pPr>
+        <w:ind w:left="2160" w:hanging="360"/>
+      </w:pPr>
+      <w:rPr>
+        <w:rFonts w:ascii="Wingdings" w:hAnsi="Wingdings" w:hint="default"/>
+      </w:rPr>
+    </w:lvl>
+    <w:lvl w:ilvl="3" w:tplc="04090001" w:tentative="1">
+      <w:start w:val="1"/>
+      <w:numFmt w:val="bullet"/>
+      <w:lvlText w:val=""/>
+      <w:lvlJc w:val="left"/>
+      <w:pPr>
+        <w:ind w:left="2880" w:hanging="360"/>
+      </w:pPr>
+      <w:rPr>
+        <w:rFonts w:ascii="Symbol" w:hAnsi="Symbol" w:hint="default"/>
+      </w:rPr>
+    </w:lvl>
+    <w:lvl w:ilvl="4" w:tplc="04090003" w:tentative="1">
+      <w:start w:val="1"/>
+      <w:numFmt w:val="bullet"/>
+      <w:lvlText w:val="o"/>
+      <w:lvlJc w:val="left"/>
+      <w:pPr>
+        <w:ind w:left="3600" w:hanging="360"/>
+      </w:pPr>
+      <w:rPr>
+        <w:rFonts w:ascii="Courier New" w:hAnsi="Courier New" w:cs="Courier New" w:hint="default"/>
+      </w:rPr>
+    </w:lvl>
+    <w:lvl w:ilvl="5" w:tplc="04090005" w:tentative="1">
+      <w:start w:val="1"/>
+      <w:numFmt w:val="bullet"/>
+      <w:lvlText w:val=""/>
+      <w:lvlJc w:val="left"/>
+      <w:pPr>
+        <w:ind w:left="4320" w:hanging="360"/>
+      </w:pPr>
+      <w:rPr>
+        <w:rFonts w:ascii="Wingdings" w:hAnsi="Wingdings" w:hint="default"/>
+      </w:rPr>
+    </w:lvl>
+    <w:lvl w:ilvl="6" w:tplc="04090001" w:tentative="1">
+      <w:start w:val="1"/>
+      <w:numFmt w:val="bullet"/>
+      <w:lvlText w:val=""/>
+      <w:lvlJc w:val="left"/>
+      <w:pPr>
+        <w:ind w:left="5040" w:hanging="360"/>
+      </w:pPr>
+      <w:rPr>
+        <w:rFonts w:ascii="Symbol" w:hAnsi="Symbol" w:hint="default"/>
+      </w:rPr>
+    </w:lvl>
+    <w:lvl w:ilvl="7" w:tplc="04090003" w:tentative="1">
+      <w:start w:val="1"/>
+      <w:numFmt w:val="bullet"/>
+      <w:lvlText w:val="o"/>
+      <w:lvlJc w:val="left"/>
+      <w:pPr>
+        <w:ind w:left="5760" w:hanging="360"/>
+      </w:pPr>
+      <w:rPr>
+        <w:rFonts w:ascii="Courier New" w:hAnsi="Courier New" w:cs="Courier New" w:hint="default"/>
+      </w:rPr>
+    </w:lvl>
+    <w:lvl w:ilvl="8" w:tplc="04090005" w:tentative="1">
+      <w:start w:val="1"/>
+      <w:numFmt w:val="bullet"/>
+      <w:lvlText w:val=""/>
+      <w:lvlJc w:val="left"/>
+      <w:pPr>
+        <w:ind w:left="6480" w:hanging="360"/>
+      </w:pPr>
+      <w:rPr>
+        <w:rFonts w:ascii="Wingdings" w:hAnsi="Wingdings" w:hint="default"/>
+      </w:rPr>
+    </w:lvl>
+  </w:abstractNum>
   <w:num w:numId="1" w16cid:durableId="725564135">
     <w:abstractNumId w:val="0"/>
   </w:num>
@@ -921,6 +1561,12 @@
   </w:num>
   <w:num w:numId="4" w16cid:durableId="1359938924">
     <w:abstractNumId w:val="1"/>
+  </w:num>
+  <w:num w:numId="5" w16cid:durableId="1426851341">
+    <w:abstractNumId w:val="5"/>
+  </w:num>
+  <w:num w:numId="6" w16cid:durableId="1010833238">
+    <w:abstractNumId w:val="4"/>
   </w:num>
 </w:numbering>
 </file>
@@ -1897,6 +2543,45 @@
       <w:shd w:val="clear" w:color="auto" w:fill="E1DFDD"/>
     </w:rPr>
   </w:style>
+  <w:style w:type="character" w:styleId="Strong">
+    <w:name w:val="Strong"/>
+    <w:basedOn w:val="DefaultParagraphFont"/>
+    <w:uiPriority w:val="22"/>
+    <w:qFormat/>
+    <w:rsid w:val="00273DD7"/>
+    <w:rPr>
+      <w:b/>
+      <w:bCs/>
+    </w:rPr>
+  </w:style>
+  <w:style w:type="paragraph" w:customStyle="1" w:styleId="assistant-hast-revision-0">
+    <w:name w:val="assistant-hast-revision-0"/>
+    <w:basedOn w:val="Normal"/>
+    <w:rsid w:val="001C04C7"/>
+    <w:pPr>
+      <w:spacing w:before="100" w:beforeAutospacing="1" w:after="100" w:afterAutospacing="1" w:line="240" w:lineRule="auto"/>
+    </w:pPr>
+    <w:rPr>
+      <w:rFonts w:ascii="Times New Roman" w:eastAsia="Times New Roman" w:hAnsi="Times New Roman" w:cs="Times New Roman"/>
+      <w:kern w:val="0"/>
+      <w:sz w:val="24"/>
+      <w14:ligatures w14:val="none"/>
+    </w:rPr>
+  </w:style>
+  <w:style w:type="paragraph" w:customStyle="1" w:styleId="py-1">
+    <w:name w:val="py-1"/>
+    <w:basedOn w:val="Normal"/>
+    <w:rsid w:val="001C04C7"/>
+    <w:pPr>
+      <w:spacing w:before="100" w:beforeAutospacing="1" w:after="100" w:afterAutospacing="1" w:line="240" w:lineRule="auto"/>
+    </w:pPr>
+    <w:rPr>
+      <w:rFonts w:ascii="Times New Roman" w:eastAsia="Times New Roman" w:hAnsi="Times New Roman" w:cs="Times New Roman"/>
+      <w:kern w:val="0"/>
+      <w:sz w:val="24"/>
+      <w14:ligatures w14:val="none"/>
+    </w:rPr>
+  </w:style>
 </w:styles>
 </file>
 

</xml_diff>